<commit_message>
MTS-44674: connect throttling and updates
</commit_message>
<xml_diff>
--- a/docs/MTS SDK Java developer guide.docx
+++ b/docs/MTS SDK Java developer guide.docx
@@ -7011,7 +7011,10 @@
               <w:cnfStyle w:val="000000100000" w:firstRow="0" w:lastRow="0" w:firstColumn="0" w:lastColumn="0" w:oddVBand="0" w:evenVBand="0" w:oddHBand="1" w:evenHBand="0" w:firstRowFirstColumn="0" w:firstRowLastColumn="0" w:lastRowFirstColumn="0" w:lastRowLastColumn="0"/>
             </w:pPr>
             <w:r>
-              <w:t>30s</w:t>
+              <w:t>2</w:t>
+            </w:r>
+            <w:r>
+              <w:t>0s</w:t>
             </w:r>
           </w:p>
         </w:tc>

</xml_diff>